<commit_message>
Added District Covered Standards section.
</commit_message>
<xml_diff>
--- a/templates/docx_templates/correlation_report_master.docx
+++ b/templates/docx_templates/correlation_report_master.docx
@@ -802,7 +802,7 @@
       <w:tblPr>
         <w:tblStyle w:val="TableGrid"/>
         <w:tblW w:w="0" w:type="auto"/>
-        <w:tblInd w:w="360" w:type="dxa"/>
+        <w:tblInd w:w="-270" w:type="dxa"/>
         <w:tblBorders>
           <w:top w:val="none" w:sz="0" w:space="0" w:color="auto"/>
           <w:left w:val="none" w:sz="0" w:space="0" w:color="auto"/>
@@ -817,7 +817,209 @@
         <w:tblLook w:val="04A0" w:firstRow="1" w:lastRow="0" w:firstColumn="1" w:lastColumn="0" w:noHBand="0" w:noVBand="1"/>
       </w:tblPr>
       <w:tblGrid>
-        <w:gridCol w:w="5040"/>
+        <w:gridCol w:w="5220"/>
+        <w:gridCol w:w="6840"/>
+      </w:tblGrid>
+      <w:tr>
+        <w:trPr>
+          <w:trHeight w:val="534"/>
+        </w:trPr>
+        <w:tc>
+          <w:tcPr>
+            <w:tcW w:w="5220" w:type="dxa"/>
+          </w:tcPr>
+          <w:p>
+            <w:pPr>
+              <w:jc w:val="right"/>
+              <w:rPr>
+                <w:color w:val="1E2757"/>
+                <w:w w:val="110"/>
+                <w:sz w:val="50"/>
+                <w:szCs w:val="50"/>
+              </w:rPr>
+            </w:pPr>
+            <w:r>
+              <w:rPr>
+                <w:color w:val="1E2757"/>
+                <w:w w:val="110"/>
+                <w:sz w:val="50"/>
+                <w:szCs w:val="50"/>
+              </w:rPr>
+              <w:lastRenderedPageBreak/>
+              <w:t>Coverage Report</w:t>
+            </w:r>
+          </w:p>
+        </w:tc>
+        <w:tc>
+          <w:tcPr>
+            <w:tcW w:w="6840" w:type="dxa"/>
+            <w:vMerge w:val="restart"/>
+            <w:vAlign w:val="center"/>
+          </w:tcPr>
+          <w:p>
+            <w:pPr>
+              <w:rPr>
+                <w:rFonts w:ascii="Times New Roman" w:hAnsi="Times New Roman" w:cs="Times New Roman"/>
+                <w:color w:val="1E2757"/>
+                <w:w w:val="110"/>
+                <w:sz w:val="20"/>
+                <w:szCs w:val="20"/>
+              </w:rPr>
+            </w:pPr>
+            <w:r>
+              <w:rPr>
+                <w:rFonts w:ascii="Times New Roman" w:hAnsi="Times New Roman" w:cs="Times New Roman"/>
+                <w:color w:val="000000" w:themeColor="text1"/>
+                <w:w w:val="110"/>
+                <w:sz w:val="20"/>
+                <w:szCs w:val="20"/>
+              </w:rPr>
+              <w:t>This section of the report lists each curriculum statement in the set chosen for this report and the titles that address it. Statements that are colored gray are not addressed by any title in the title set chosen for this report.</w:t>
+            </w:r>
+          </w:p>
+        </w:tc>
+      </w:tr>
+      <w:tr>
+        <w:trPr>
+          <w:trHeight w:val="486"/>
+        </w:trPr>
+        <w:tc>
+          <w:tcPr>
+            <w:tcW w:w="5220" w:type="dxa"/>
+          </w:tcPr>
+          <w:p>
+            <w:pPr>
+              <w:ind w:firstLine="66"/>
+              <w:jc w:val="right"/>
+              <w:rPr>
+                <w:color w:val="1E2757"/>
+                <w:sz w:val="36"/>
+                <w:szCs w:val="36"/>
+              </w:rPr>
+            </w:pPr>
+            <w:r>
+              <w:rPr>
+                <w:color w:val="1E2757"/>
+                <w:w w:val="110"/>
+                <w:sz w:val="36"/>
+                <w:szCs w:val="36"/>
+              </w:rPr>
+              <w:t xml:space="preserve">Organized by </w:t>
+            </w:r>
+            <w:r>
+              <w:rPr>
+                <w:color w:val="1E2757"/>
+                <w:w w:val="110"/>
+                <w:sz w:val="36"/>
+                <w:szCs w:val="36"/>
+              </w:rPr>
+              <w:t xml:space="preserve">Product </w:t>
+            </w:r>
+          </w:p>
+        </w:tc>
+        <w:tc>
+          <w:tcPr>
+            <w:tcW w:w="6840" w:type="dxa"/>
+            <w:vMerge/>
+          </w:tcPr>
+          <w:p>
+            <w:pPr>
+              <w:rPr>
+                <w:color w:val="1E2757"/>
+                <w:w w:val="110"/>
+                <w:sz w:val="36"/>
+                <w:szCs w:val="36"/>
+              </w:rPr>
+            </w:pPr>
+          </w:p>
+        </w:tc>
+      </w:tr>
+    </w:tbl>
+    <w:p>
+      <w:pPr>
+        <w:rPr>
+          <w:color w:val="1E2757"/>
+          <w:sz w:val="16"/>
+          <w:szCs w:val="16"/>
+        </w:rPr>
+      </w:pPr>
+    </w:p>
+    <w:p>
+      <w:pPr>
+        <w:rPr>
+          <w:color w:val="1E2757"/>
+          <w:sz w:val="16"/>
+          <w:szCs w:val="16"/>
+        </w:rPr>
+      </w:pPr>
+      <w:r>
+        <w:rPr>
+          <w:color w:val="1E2757"/>
+          <w:sz w:val="16"/>
+          <w:szCs w:val="16"/>
+        </w:rPr>
+        <w:t xml:space="preserve">{{ </w:t>
+      </w:r>
+      <w:proofErr w:type="spellStart"/>
+      <w:r>
+        <w:rPr>
+          <w:color w:val="1E2757"/>
+          <w:sz w:val="16"/>
+          <w:szCs w:val="16"/>
+        </w:rPr>
+        <w:t>coverage_report_by_product</w:t>
+      </w:r>
+      <w:proofErr w:type="spellEnd"/>
+      <w:r>
+        <w:rPr>
+          <w:color w:val="1E2757"/>
+          <w:sz w:val="16"/>
+          <w:szCs w:val="16"/>
+        </w:rPr>
+        <w:t xml:space="preserve"> }}</w:t>
+      </w:r>
+    </w:p>
+    <w:p>
+      <w:pPr>
+        <w:widowControl/>
+        <w:autoSpaceDE/>
+        <w:autoSpaceDN/>
+        <w:rPr>
+          <w:color w:val="1E2757"/>
+          <w:sz w:val="16"/>
+          <w:szCs w:val="16"/>
+        </w:rPr>
+      </w:pPr>
+      <w:r>
+        <w:rPr>
+          <w:color w:val="1E2757"/>
+          <w:sz w:val="16"/>
+          <w:szCs w:val="16"/>
+        </w:rPr>
+        <w:br w:type="page"/>
+      </w:r>
+    </w:p>
+    <w:tbl>
+      <w:tblPr>
+        <w:tblStyle w:val="TableGrid"/>
+        <w:tblW w:w="0" w:type="auto"/>
+        <w:tblInd w:w="-270" w:type="dxa"/>
+        <w:tblBorders>
+          <w:top w:val="none" w:sz="0" w:space="0" w:color="auto"/>
+          <w:left w:val="none" w:sz="0" w:space="0" w:color="auto"/>
+          <w:bottom w:val="none" w:sz="0" w:space="0" w:color="auto"/>
+          <w:right w:val="none" w:sz="0" w:space="0" w:color="auto"/>
+          <w:insideH w:val="none" w:sz="0" w:space="0" w:color="auto"/>
+          <w:insideV w:val="single" w:sz="4" w:space="0" w:color="595959" w:themeColor="text1" w:themeTint="A6"/>
+        </w:tblBorders>
+        <w:tblCellMar>
+          <w:left w:w="86" w:type="dxa"/>
+          <w:right w:w="144" w:type="dxa"/>
+        </w:tblCellMar>
+        <w:tblLook w:val="04A0" w:firstRow="1" w:lastRow="0" w:firstColumn="1" w:lastColumn="0" w:noHBand="0" w:noVBand="1"/>
+      </w:tblPr>
+      <w:tblGrid>
+        <w:gridCol w:w="5580"/>
         <w:gridCol w:w="6390"/>
       </w:tblGrid>
       <w:tr>
@@ -826,7 +1028,7 @@
         </w:trPr>
         <w:tc>
           <w:tcPr>
-            <w:tcW w:w="5040" w:type="dxa"/>
+            <w:tcW w:w="5580" w:type="dxa"/>
           </w:tcPr>
           <w:p>
             <w:pPr>
@@ -874,7 +1076,27 @@
                 <w:sz w:val="20"/>
                 <w:szCs w:val="20"/>
               </w:rPr>
-              <w:t>This section of the report lists each curriculum statement in the set chosen for this report and the titles that address it. Statements that are colored gray are not addressed by any title in the title set chosen for this report.</w:t>
+              <w:t xml:space="preserve">This section of the report lists </w:t>
+            </w:r>
+            <w:r>
+              <w:rPr>
+                <w:rFonts w:ascii="Times New Roman" w:hAnsi="Times New Roman" w:cs="Times New Roman"/>
+                <w:color w:val="000000" w:themeColor="text1"/>
+                <w:w w:val="110"/>
+                <w:sz w:val="20"/>
+                <w:szCs w:val="20"/>
+              </w:rPr>
+              <w:t>any standards not addressed by any title in the title set chosen for this report, and the resources that will cover them</w:t>
+            </w:r>
+            <w:r>
+              <w:rPr>
+                <w:rFonts w:ascii="Times New Roman" w:hAnsi="Times New Roman" w:cs="Times New Roman"/>
+                <w:color w:val="000000" w:themeColor="text1"/>
+                <w:w w:val="110"/>
+                <w:sz w:val="20"/>
+                <w:szCs w:val="20"/>
+              </w:rPr>
+              <w:t>.</w:t>
             </w:r>
           </w:p>
         </w:tc>
@@ -885,7 +1107,7 @@
         </w:trPr>
         <w:tc>
           <w:tcPr>
-            <w:tcW w:w="5040" w:type="dxa"/>
+            <w:tcW w:w="5580" w:type="dxa"/>
           </w:tcPr>
           <w:p>
             <w:pPr>
@@ -904,16 +1126,7 @@
                 <w:sz w:val="36"/>
                 <w:szCs w:val="36"/>
               </w:rPr>
-              <w:t xml:space="preserve">Organized by </w:t>
-            </w:r>
-            <w:r>
-              <w:rPr>
-                <w:color w:val="1E2757"/>
-                <w:w w:val="110"/>
-                <w:sz w:val="36"/>
-                <w:szCs w:val="36"/>
-              </w:rPr>
-              <w:t>Product Title</w:t>
+              <w:t>District Covered Standards</w:t>
             </w:r>
           </w:p>
         </w:tc>
@@ -967,7 +1180,7 @@
           <w:sz w:val="16"/>
           <w:szCs w:val="16"/>
         </w:rPr>
-        <w:t>coverage_report_by_product</w:t>
+        <w:t>district_covered_standards</w:t>
       </w:r>
       <w:proofErr w:type="spellEnd"/>
       <w:r>

</xml_diff>